<commit_message>
Fix Test 4 Crib Sheet
</commit_message>
<xml_diff>
--- a/exams/Test 4 Crib Sheet.docx
+++ b/exams/Test 4 Crib Sheet.docx
@@ -9562,6 +9562,7 @@
           <w:sz w:val="14"/>
           <w:szCs w:val="14"/>
         </w:rPr>
+        <w:lastRenderedPageBreak/>
         <mc:AlternateContent>
           <mc:Choice Requires="wpg">
             <w:drawing>
@@ -10191,7 +10192,7 @@
         <mc:AlternateContent>
           <mc:Choice Requires="wpg">
             <w:drawing>
-              <wp:anchor distT="0" distB="0" distL="114300" distR="114300" simplePos="0" relativeHeight="251696128" behindDoc="0" locked="0" layoutInCell="1" allowOverlap="1" wp14:anchorId="72149154" wp14:editId="01EFB5D4">
+              <wp:anchor distT="0" distB="0" distL="114300" distR="114300" simplePos="0" relativeHeight="251696128" behindDoc="0" locked="0" layoutInCell="1" allowOverlap="1" wp14:anchorId="72149154" wp14:editId="1B4A6FB4">
                 <wp:simplePos x="0" y="0"/>
                 <wp:positionH relativeFrom="column">
                   <wp:posOffset>5372834</wp:posOffset>
@@ -11808,6 +11809,7 @@
           <w:sz w:val="14"/>
           <w:szCs w:val="14"/>
         </w:rPr>
+        <w:lastRenderedPageBreak/>
         <w:t xml:space="preserve">    sayHello("Alice");   // calls sayHello.operator()("Alice")</w:t>
       </w:r>
     </w:p>
@@ -14386,6 +14388,7 @@
           <w:sz w:val="14"/>
           <w:szCs w:val="14"/>
         </w:rPr>
+        <w:lastRenderedPageBreak/>
         <w:t xml:space="preserve">    std::cout &lt;&lt; "Original array:\n";</w:t>
       </w:r>
     </w:p>
@@ -17239,6 +17242,68 @@
       <w:r>
         <w:rPr>
           <w:noProof/>
+          <w:sz w:val="14"/>
+          <w:szCs w:val="14"/>
+        </w:rPr>
+        <w:drawing>
+          <wp:anchor distT="0" distB="0" distL="114300" distR="114300" simplePos="0" relativeHeight="251730944" behindDoc="0" locked="0" layoutInCell="1" allowOverlap="1" wp14:anchorId="1EBD3235" wp14:editId="29AF7AC5">
+            <wp:simplePos x="0" y="0"/>
+            <wp:positionH relativeFrom="margin">
+              <wp:posOffset>3632484</wp:posOffset>
+            </wp:positionH>
+            <wp:positionV relativeFrom="paragraph">
+              <wp:posOffset>5592</wp:posOffset>
+            </wp:positionV>
+            <wp:extent cx="2571750" cy="1999629"/>
+            <wp:effectExtent l="0" t="0" r="0" b="635"/>
+            <wp:wrapNone/>
+            <wp:docPr id="1374500029" name="Picture 1" descr="Rhonbs Ea. Tso Ryht.&#10;&#10;AI-generated content may be incorrect."/>
+            <wp:cNvGraphicFramePr>
+              <a:graphicFrameLocks xmlns:a="http://schemas.openxmlformats.org/drawingml/2006/main" noChangeAspect="1"/>
+            </wp:cNvGraphicFramePr>
+            <a:graphic xmlns:a="http://schemas.openxmlformats.org/drawingml/2006/main">
+              <a:graphicData uri="http://schemas.openxmlformats.org/drawingml/2006/picture">
+                <pic:pic xmlns:pic="http://schemas.openxmlformats.org/drawingml/2006/picture">
+                  <pic:nvPicPr>
+                    <pic:cNvPr id="1374500029" name="Picture 1" descr="Rhonbs Ea. Tso Ryht.&#10;&#10;AI-generated content may be incorrect."/>
+                    <pic:cNvPicPr/>
+                  </pic:nvPicPr>
+                  <pic:blipFill>
+                    <a:blip r:embed="rId35" cstate="print">
+                      <a:extLst>
+                        <a:ext uri="{28A0092B-C50C-407E-A947-70E740481C1C}">
+                          <a14:useLocalDpi xmlns:a14="http://schemas.microsoft.com/office/drawing/2010/main" val="0"/>
+                        </a:ext>
+                      </a:extLst>
+                    </a:blip>
+                    <a:stretch>
+                      <a:fillRect/>
+                    </a:stretch>
+                  </pic:blipFill>
+                  <pic:spPr>
+                    <a:xfrm>
+                      <a:off x="0" y="0"/>
+                      <a:ext cx="2571750" cy="1999629"/>
+                    </a:xfrm>
+                    <a:prstGeom prst="rect">
+                      <a:avLst/>
+                    </a:prstGeom>
+                  </pic:spPr>
+                </pic:pic>
+              </a:graphicData>
+            </a:graphic>
+            <wp14:sizeRelH relativeFrom="margin">
+              <wp14:pctWidth>0</wp14:pctWidth>
+            </wp14:sizeRelH>
+            <wp14:sizeRelV relativeFrom="margin">
+              <wp14:pctHeight>0</wp14:pctHeight>
+            </wp14:sizeRelV>
+          </wp:anchor>
+        </w:drawing>
+      </w:r>
+      <w:r>
+        <w:rPr>
+          <w:noProof/>
         </w:rPr>
         <w:drawing>
           <wp:anchor distT="0" distB="0" distL="114300" distR="114300" simplePos="0" relativeHeight="251729920" behindDoc="0" locked="0" layoutInCell="1" allowOverlap="1" wp14:anchorId="4A6A9F2A" wp14:editId="33A6A6AC">
@@ -17266,7 +17331,7 @@
                     </pic:cNvPicPr>
                   </pic:nvPicPr>
                   <pic:blipFill>
-                    <a:blip r:embed="rId35">
+                    <a:blip r:embed="rId36">
                       <a:extLst>
                         <a:ext uri="{28A0092B-C50C-407E-A947-70E740481C1C}">
                           <a14:useLocalDpi xmlns:a14="http://schemas.microsoft.com/office/drawing/2010/main" val="0"/>
@@ -17399,138 +17464,146 @@
       </w:pPr>
       <w:r>
         <w:rPr>
+          <w:sz w:val="14"/>
+          <w:szCs w:val="14"/>
+        </w:rPr>
+        <w:t xml:space="preserve">    D(int b1, int c1):B(b1),C(c1),d(b1+c1){}</w:t>
+      </w:r>
+    </w:p>
+    <w:p>
+      <w:pPr>
+        <w:spacing w:after="0" w:line="240" w:lineRule="auto"/>
+        <w:rPr>
+          <w:sz w:val="14"/>
+          <w:szCs w:val="14"/>
+        </w:rPr>
+      </w:pPr>
+      <w:r>
+        <w:rPr>
+          <w:sz w:val="14"/>
+          <w:szCs w:val="14"/>
+        </w:rPr>
+        <w:t xml:space="preserve">    void print(){</w:t>
+      </w:r>
+    </w:p>
+    <w:p>
+      <w:pPr>
+        <w:spacing w:after="0" w:line="240" w:lineRule="auto"/>
+        <w:rPr>
+          <w:sz w:val="14"/>
+          <w:szCs w:val="14"/>
+        </w:rPr>
+      </w:pPr>
+      <w:r>
+        <w:rPr>
+          <w:sz w:val="14"/>
+          <w:szCs w:val="14"/>
+        </w:rPr>
+        <w:t xml:space="preserve">        std::cout &lt;&lt; "d is " &lt;&lt; d &lt;&lt; std::endl;</w:t>
+      </w:r>
+    </w:p>
+    <w:p>
+      <w:pPr>
+        <w:spacing w:after="0" w:line="240" w:lineRule="auto"/>
+        <w:rPr>
+          <w:sz w:val="14"/>
+          <w:szCs w:val="14"/>
+        </w:rPr>
+      </w:pPr>
+      <w:r>
+        <w:rPr>
+          <w:sz w:val="14"/>
+          <w:szCs w:val="14"/>
+        </w:rPr>
+        <w:t xml:space="preserve">    }</w:t>
+      </w:r>
+    </w:p>
+    <w:p>
+      <w:pPr>
+        <w:spacing w:after="0" w:line="240" w:lineRule="auto"/>
+        <w:rPr>
+          <w:sz w:val="14"/>
+          <w:szCs w:val="14"/>
+        </w:rPr>
+      </w:pPr>
+      <w:r>
+        <w:rPr>
+          <w:sz w:val="14"/>
+          <w:szCs w:val="14"/>
+        </w:rPr>
+        <w:t>protected:</w:t>
+      </w:r>
+      <w:r>
+        <w:t xml:space="preserve"> </w:t>
+      </w:r>
+    </w:p>
+    <w:p>
+      <w:pPr>
+        <w:spacing w:after="0" w:line="240" w:lineRule="auto"/>
+        <w:rPr>
+          <w:sz w:val="14"/>
+          <w:szCs w:val="14"/>
+        </w:rPr>
+      </w:pPr>
+      <w:r>
+        <w:rPr>
+          <w:sz w:val="14"/>
+          <w:szCs w:val="14"/>
+        </w:rPr>
+        <w:t xml:space="preserve">    int d;</w:t>
+      </w:r>
+    </w:p>
+    <w:p>
+      <w:pPr>
+        <w:spacing w:after="0" w:line="240" w:lineRule="auto"/>
+        <w:rPr>
+          <w:sz w:val="14"/>
+          <w:szCs w:val="14"/>
+        </w:rPr>
+      </w:pPr>
+      <w:r>
+        <w:rPr>
+          <w:sz w:val="14"/>
+          <w:szCs w:val="14"/>
+        </w:rPr>
+        <w:t>};</w:t>
+      </w:r>
+    </w:p>
+    <w:p>
+      <w:pPr>
+        <w:spacing w:after="0" w:line="240" w:lineRule="auto"/>
+        <w:rPr>
+          <w:sz w:val="14"/>
+          <w:szCs w:val="14"/>
+        </w:rPr>
+      </w:pPr>
+      <w:r>
+        <w:rPr>
+          <w:sz w:val="14"/>
+          <w:szCs w:val="14"/>
+        </w:rPr>
+        <w:t>int main(){</w:t>
+      </w:r>
+    </w:p>
+    <w:p>
+      <w:pPr>
+        <w:spacing w:after="0" w:line="240" w:lineRule="auto"/>
+        <w:rPr>
+          <w:sz w:val="14"/>
+          <w:szCs w:val="14"/>
+        </w:rPr>
+      </w:pPr>
+      <w:r>
+        <w:rPr>
+          <w:sz w:val="14"/>
+          <w:szCs w:val="14"/>
+        </w:rPr>
+        <w:t xml:space="preserve">    D* dOjbect = new D(2,3);</w:t>
+      </w:r>
+      <w:r>
+        <w:rPr>
           <w:noProof/>
-          <w:sz w:val="14"/>
-          <w:szCs w:val="14"/>
-        </w:rPr>
-        <w:drawing>
-          <wp:anchor distT="0" distB="0" distL="114300" distR="114300" simplePos="0" relativeHeight="251730944" behindDoc="0" locked="0" layoutInCell="1" allowOverlap="1" wp14:anchorId="1EBD3235" wp14:editId="7A9ADD9D">
-            <wp:simplePos x="0" y="0"/>
-            <wp:positionH relativeFrom="margin">
-              <wp:posOffset>3537044</wp:posOffset>
-            </wp:positionH>
-            <wp:positionV relativeFrom="paragraph">
-              <wp:posOffset>22586</wp:posOffset>
-            </wp:positionV>
-            <wp:extent cx="2571750" cy="1999629"/>
-            <wp:effectExtent l="0" t="0" r="0" b="635"/>
-            <wp:wrapNone/>
-            <wp:docPr id="1374500029" name="Picture 1" descr="Rhonbs Ea. Tso Ryht.&#10;&#10;AI-generated content may be incorrect."/>
-            <wp:cNvGraphicFramePr>
-              <a:graphicFrameLocks xmlns:a="http://schemas.openxmlformats.org/drawingml/2006/main" noChangeAspect="1"/>
-            </wp:cNvGraphicFramePr>
-            <a:graphic xmlns:a="http://schemas.openxmlformats.org/drawingml/2006/main">
-              <a:graphicData uri="http://schemas.openxmlformats.org/drawingml/2006/picture">
-                <pic:pic xmlns:pic="http://schemas.openxmlformats.org/drawingml/2006/picture">
-                  <pic:nvPicPr>
-                    <pic:cNvPr id="1374500029" name="Picture 1" descr="Rhonbs Ea. Tso Ryht.&#10;&#10;AI-generated content may be incorrect."/>
-                    <pic:cNvPicPr/>
-                  </pic:nvPicPr>
-                  <pic:blipFill>
-                    <a:blip r:embed="rId36" cstate="print">
-                      <a:extLst>
-                        <a:ext uri="{28A0092B-C50C-407E-A947-70E740481C1C}">
-                          <a14:useLocalDpi xmlns:a14="http://schemas.microsoft.com/office/drawing/2010/main" val="0"/>
-                        </a:ext>
-                      </a:extLst>
-                    </a:blip>
-                    <a:stretch>
-                      <a:fillRect/>
-                    </a:stretch>
-                  </pic:blipFill>
-                  <pic:spPr>
-                    <a:xfrm>
-                      <a:off x="0" y="0"/>
-                      <a:ext cx="2571750" cy="1999629"/>
-                    </a:xfrm>
-                    <a:prstGeom prst="rect">
-                      <a:avLst/>
-                    </a:prstGeom>
-                  </pic:spPr>
-                </pic:pic>
-              </a:graphicData>
-            </a:graphic>
-            <wp14:sizeRelH relativeFrom="margin">
-              <wp14:pctWidth>0</wp14:pctWidth>
-            </wp14:sizeRelH>
-            <wp14:sizeRelV relativeFrom="margin">
-              <wp14:pctHeight>0</wp14:pctHeight>
-            </wp14:sizeRelV>
-          </wp:anchor>
-        </w:drawing>
-      </w:r>
-      <w:r>
-        <w:rPr>
-          <w:sz w:val="14"/>
-          <w:szCs w:val="14"/>
-        </w:rPr>
-        <w:t xml:space="preserve">    D(int b1, int c1):B(b1),C(c1),d(b1+c1){}</w:t>
-      </w:r>
-    </w:p>
-    <w:p>
-      <w:pPr>
-        <w:spacing w:after="0" w:line="240" w:lineRule="auto"/>
-        <w:rPr>
-          <w:sz w:val="14"/>
-          <w:szCs w:val="14"/>
-        </w:rPr>
-      </w:pPr>
-      <w:r>
-        <w:rPr>
-          <w:sz w:val="14"/>
-          <w:szCs w:val="14"/>
-        </w:rPr>
-        <w:t xml:space="preserve">    void print(){</w:t>
-      </w:r>
-    </w:p>
-    <w:p>
-      <w:pPr>
-        <w:spacing w:after="0" w:line="240" w:lineRule="auto"/>
-        <w:rPr>
-          <w:sz w:val="14"/>
-          <w:szCs w:val="14"/>
-        </w:rPr>
-      </w:pPr>
-      <w:r>
-        <w:rPr>
-          <w:sz w:val="14"/>
-          <w:szCs w:val="14"/>
-        </w:rPr>
-        <w:t xml:space="preserve">        std::cout &lt;&lt; "d is " &lt;&lt; d &lt;&lt; std::endl;</w:t>
-      </w:r>
-    </w:p>
-    <w:p>
-      <w:pPr>
-        <w:spacing w:after="0" w:line="240" w:lineRule="auto"/>
-        <w:rPr>
-          <w:sz w:val="14"/>
-          <w:szCs w:val="14"/>
-        </w:rPr>
-      </w:pPr>
-      <w:r>
-        <w:rPr>
-          <w:sz w:val="14"/>
-          <w:szCs w:val="14"/>
-        </w:rPr>
-        <w:t xml:space="preserve">    }</w:t>
-      </w:r>
-    </w:p>
-    <w:p>
-      <w:pPr>
-        <w:spacing w:after="0" w:line="240" w:lineRule="auto"/>
-        <w:rPr>
-          <w:sz w:val="14"/>
-          <w:szCs w:val="14"/>
-        </w:rPr>
-      </w:pPr>
-      <w:r>
-        <w:rPr>
-          <w:sz w:val="14"/>
-          <w:szCs w:val="14"/>
-        </w:rPr>
-        <w:t>protected:</w:t>
-      </w:r>
-      <w:r>
+        </w:rPr>
         <w:t xml:space="preserve"> </w:t>
       </w:r>
     </w:p>
@@ -17547,76 +17620,6 @@
           <w:sz w:val="14"/>
           <w:szCs w:val="14"/>
         </w:rPr>
-        <w:t xml:space="preserve">    int d;</w:t>
-      </w:r>
-    </w:p>
-    <w:p>
-      <w:pPr>
-        <w:spacing w:after="0" w:line="240" w:lineRule="auto"/>
-        <w:rPr>
-          <w:sz w:val="14"/>
-          <w:szCs w:val="14"/>
-        </w:rPr>
-      </w:pPr>
-      <w:r>
-        <w:rPr>
-          <w:sz w:val="14"/>
-          <w:szCs w:val="14"/>
-        </w:rPr>
-        <w:t>};</w:t>
-      </w:r>
-    </w:p>
-    <w:p>
-      <w:pPr>
-        <w:spacing w:after="0" w:line="240" w:lineRule="auto"/>
-        <w:rPr>
-          <w:sz w:val="14"/>
-          <w:szCs w:val="14"/>
-        </w:rPr>
-      </w:pPr>
-      <w:r>
-        <w:rPr>
-          <w:sz w:val="14"/>
-          <w:szCs w:val="14"/>
-        </w:rPr>
-        <w:t>int main(){</w:t>
-      </w:r>
-    </w:p>
-    <w:p>
-      <w:pPr>
-        <w:spacing w:after="0" w:line="240" w:lineRule="auto"/>
-        <w:rPr>
-          <w:sz w:val="14"/>
-          <w:szCs w:val="14"/>
-        </w:rPr>
-      </w:pPr>
-      <w:r>
-        <w:rPr>
-          <w:sz w:val="14"/>
-          <w:szCs w:val="14"/>
-        </w:rPr>
-        <w:t xml:space="preserve">    D* dOjbect = new D(2,3);</w:t>
-      </w:r>
-      <w:r>
-        <w:rPr>
-          <w:noProof/>
-        </w:rPr>
-        <w:t xml:space="preserve"> </w:t>
-      </w:r>
-    </w:p>
-    <w:p>
-      <w:pPr>
-        <w:spacing w:after="0" w:line="240" w:lineRule="auto"/>
-        <w:rPr>
-          <w:sz w:val="14"/>
-          <w:szCs w:val="14"/>
-        </w:rPr>
-      </w:pPr>
-      <w:r>
-        <w:rPr>
-          <w:sz w:val="14"/>
-          <w:szCs w:val="14"/>
-        </w:rPr>
         <w:t xml:space="preserve">    dOjbect-&gt;print();</w:t>
       </w:r>
     </w:p>
@@ -17706,6 +17709,7 @@
           <w:sz w:val="14"/>
           <w:szCs w:val="14"/>
         </w:rPr>
+        <w:lastRenderedPageBreak/>
         <w:t>class Worker  : virtual public Human {};</w:t>
       </w:r>
     </w:p>

</xml_diff>